<commit_message>
feat(certificates): add DataCamp Introduction to Python (cert #18) and update Word CV
</commit_message>
<xml_diff>
--- a/مشروع/Hussein_Mohamed_ElBassiouni_CV.docx
+++ b/مشروع/Hussein_Mohamed_ElBassiouni_CV.docx
@@ -12,14 +12,14 @@
           <w:rFonts w:ascii="Calibri" w:hAnsi="Calibri"/>
           <w:b/>
           <w:color w:val="0F172A"/>
-          <w:sz w:val="33"/>
+          <w:sz w:val="32"/>
         </w:rPr>
         <w:t>HUSSEIN MOHAMED MOSTAFA AHMED ELBASSIOUNI</w:t>
       </w:r>
     </w:p>
     <w:p>
       <w:pPr>
-        <w:spacing w:before="0" w:after="40"/>
+        <w:spacing w:before="0" w:after="30"/>
         <w:jc w:val="center"/>
       </w:pPr>
       <w:r>
@@ -34,7 +34,7 @@
     </w:p>
     <w:p>
       <w:pPr>
-        <w:spacing w:before="0" w:after="80"/>
+        <w:spacing w:before="0" w:after="60"/>
         <w:jc w:val="center"/>
       </w:pPr>
       <w:r>
@@ -48,7 +48,7 @@
     </w:p>
     <w:p>
       <w:pPr>
-        <w:spacing w:before="100" w:after="40" w:line="240" w:lineRule="auto"/>
+        <w:spacing w:before="80" w:after="30" w:line="240" w:lineRule="auto"/>
         <w:pBdr>
           <w:bottom w:val="single" w:sz="6" w:space="1" w:color="2563EB"/>
         </w:pBdr>
@@ -58,7 +58,7 @@
           <w:rFonts w:ascii="Calibri" w:hAnsi="Calibri"/>
           <w:b/>
           <w:color w:val="1E293B"/>
-          <w:sz w:val="21"/>
+          <w:sz w:val="20"/>
         </w:rPr>
         <w:t>PROFESSIONAL SUMMARY</w:t>
       </w:r>
@@ -78,7 +78,7 @@
     </w:p>
     <w:p>
       <w:pPr>
-        <w:spacing w:before="100" w:after="40" w:line="240" w:lineRule="auto"/>
+        <w:spacing w:before="80" w:after="30" w:line="240" w:lineRule="auto"/>
         <w:pBdr>
           <w:bottom w:val="single" w:sz="6" w:space="1" w:color="2563EB"/>
         </w:pBdr>
@@ -88,16 +88,16 @@
           <w:rFonts w:ascii="Calibri" w:hAnsi="Calibri"/>
           <w:b/>
           <w:color w:val="1E293B"/>
-          <w:sz w:val="21"/>
+          <w:sz w:val="20"/>
         </w:rPr>
         <w:t>TECHNICAL PROJECTS &amp; SYSTEMS ARCHITECTURE</w:t>
       </w:r>
     </w:p>
     <w:p>
       <w:pPr>
-        <w:spacing w:before="60" w:after="20" w:line="252" w:lineRule="auto"/>
+        <w:spacing w:before="44" w:after="16" w:line="245" w:lineRule="auto"/>
         <w:tabs>
-          <w:tab w:val="right" w:pos="10800"/>
+          <w:tab w:val="right" w:pos="10900"/>
         </w:tabs>
       </w:pPr>
       <w:r>
@@ -133,7 +133,7 @@
     </w:p>
     <w:p>
       <w:pPr>
-        <w:spacing w:before="0" w:after="30" w:line="252" w:lineRule="auto"/>
+        <w:spacing w:before="0" w:after="20" w:line="245" w:lineRule="auto"/>
         <w:ind w:left="259" w:hanging="202"/>
       </w:pPr>
       <w:r>
@@ -164,7 +164,7 @@
     </w:p>
     <w:p>
       <w:pPr>
-        <w:spacing w:before="0" w:after="30" w:line="252" w:lineRule="auto"/>
+        <w:spacing w:before="0" w:after="20" w:line="245" w:lineRule="auto"/>
         <w:ind w:left="259" w:hanging="202"/>
       </w:pPr>
       <w:r>
@@ -195,7 +195,7 @@
     </w:p>
     <w:p>
       <w:pPr>
-        <w:spacing w:before="0" w:after="30" w:line="252" w:lineRule="auto"/>
+        <w:spacing w:before="0" w:after="20" w:line="245" w:lineRule="auto"/>
         <w:ind w:left="259" w:hanging="202"/>
       </w:pPr>
       <w:r>
@@ -226,7 +226,7 @@
     </w:p>
     <w:p>
       <w:pPr>
-        <w:spacing w:before="0" w:after="30" w:line="252" w:lineRule="auto"/>
+        <w:spacing w:before="0" w:after="20" w:line="245" w:lineRule="auto"/>
         <w:ind w:left="259" w:hanging="202"/>
       </w:pPr>
       <w:r>
@@ -257,7 +257,7 @@
     </w:p>
     <w:p>
       <w:pPr>
-        <w:spacing w:before="100" w:after="40" w:line="240" w:lineRule="auto"/>
+        <w:spacing w:before="80" w:after="30" w:line="240" w:lineRule="auto"/>
         <w:pBdr>
           <w:bottom w:val="single" w:sz="6" w:space="1" w:color="2563EB"/>
         </w:pBdr>
@@ -267,16 +267,16 @@
           <w:rFonts w:ascii="Calibri" w:hAnsi="Calibri"/>
           <w:b/>
           <w:color w:val="1E293B"/>
-          <w:sz w:val="21"/>
+          <w:sz w:val="20"/>
         </w:rPr>
         <w:t>PROFESSIONAL CERTIFICATIONS &amp; CREDENTIALS</w:t>
       </w:r>
     </w:p>
     <w:p>
       <w:pPr>
-        <w:spacing w:before="60" w:after="20" w:line="252" w:lineRule="auto"/>
+        <w:spacing w:before="44" w:after="16" w:line="245" w:lineRule="auto"/>
         <w:tabs>
-          <w:tab w:val="right" w:pos="10800"/>
+          <w:tab w:val="right" w:pos="10900"/>
         </w:tabs>
       </w:pPr>
       <w:r>
@@ -286,7 +286,7 @@
           <w:color w:val="0F172A"/>
           <w:sz w:val="19"/>
         </w:rPr>
-        <w:t>Google Sheets Fundamentals (15-Hour Skill Track)</w:t>
+        <w:t>DataCamp Certified Tracks &amp; Coursework</w:t>
       </w:r>
       <w:r>
         <w:rPr>
@@ -295,7 +295,7 @@
           <w:color w:val="334155"/>
           <w:sz w:val="18"/>
         </w:rPr>
-        <w:t xml:space="preserve"> | DataCamp (Credential #967,410)</w:t>
+        <w:t xml:space="preserve"> | DataCamp (Credentials #967,410 &amp; #47,542,030)</w:t>
       </w:r>
       <w:r>
         <w:tab/>
@@ -312,7 +312,7 @@
     </w:p>
     <w:p>
       <w:pPr>
-        <w:spacing w:before="0" w:after="30" w:line="252" w:lineRule="auto"/>
+        <w:spacing w:before="0" w:after="20" w:line="245" w:lineRule="auto"/>
         <w:ind w:left="259" w:hanging="202"/>
       </w:pPr>
       <w:r>
@@ -329,14 +329,36 @@
           <w:color w:val="334155"/>
           <w:sz w:val="18"/>
         </w:rPr>
-        <w:t>Comprehensive 15-hour curriculum unifying 5 accredited courses: Introduction to Google Sheets, Data Analysis, Intermediate Spreadsheets, Pivot Tables, and Data Visualization. Mastered complex VLOOKUPs, data cleaning, logical error handling, and interactive executive dashboard architecture.</w:t>
+        <w:t>Google Sheets Fundamentals (15-Hour Skill Track): Comprehensive 5-course track (Intro, Data Analysis, Intermediate, Pivot Tables, Visualization). Mastered complex VLOOKUPs, data modeling, logical error handling, and executive dashboard architecture.</w:t>
       </w:r>
     </w:p>
     <w:p>
       <w:pPr>
-        <w:spacing w:before="60" w:after="20" w:line="252" w:lineRule="auto"/>
+        <w:spacing w:before="0" w:after="20" w:line="245" w:lineRule="auto"/>
+        <w:ind w:left="259" w:hanging="202"/>
+      </w:pPr>
+      <w:r>
+        <w:rPr>
+          <w:rFonts w:ascii="Calibri" w:hAnsi="Calibri"/>
+          <w:color w:val="2563EB"/>
+          <w:sz w:val="18"/>
+        </w:rPr>
+        <w:t xml:space="preserve">•  </w:t>
+      </w:r>
+      <w:r>
+        <w:rPr>
+          <w:rFonts w:ascii="Calibri" w:hAnsi="Calibri"/>
+          <w:color w:val="334155"/>
+          <w:sz w:val="18"/>
+        </w:rPr>
+        <w:t>Introduction to Python (4-Hour Course): Practical foundational programming for data analysis; covered variables, list manipulation &amp; slicing, custom functions, package management, and 2D numerical analysis &amp; statistics via NumPy.</w:t>
+      </w:r>
+    </w:p>
+    <w:p>
+      <w:pPr>
+        <w:spacing w:before="44" w:after="16" w:line="245" w:lineRule="auto"/>
         <w:tabs>
-          <w:tab w:val="right" w:pos="10800"/>
+          <w:tab w:val="right" w:pos="10900"/>
         </w:tabs>
       </w:pPr>
       <w:r>
@@ -372,7 +394,7 @@
     </w:p>
     <w:p>
       <w:pPr>
-        <w:spacing w:before="0" w:after="30" w:line="252" w:lineRule="auto"/>
+        <w:spacing w:before="0" w:after="20" w:line="245" w:lineRule="auto"/>
         <w:ind w:left="259" w:hanging="202"/>
       </w:pPr>
       <w:r>
@@ -394,9 +416,9 @@
     </w:p>
     <w:p>
       <w:pPr>
-        <w:spacing w:before="60" w:after="20" w:line="252" w:lineRule="auto"/>
+        <w:spacing w:before="44" w:after="16" w:line="245" w:lineRule="auto"/>
         <w:tabs>
-          <w:tab w:val="right" w:pos="10800"/>
+          <w:tab w:val="right" w:pos="10900"/>
         </w:tabs>
       </w:pPr>
       <w:r>
@@ -432,7 +454,7 @@
     </w:p>
     <w:p>
       <w:pPr>
-        <w:spacing w:before="0" w:after="30" w:line="252" w:lineRule="auto"/>
+        <w:spacing w:before="0" w:after="20" w:line="245" w:lineRule="auto"/>
         <w:ind w:left="259" w:hanging="202"/>
       </w:pPr>
       <w:r>
@@ -454,7 +476,7 @@
     </w:p>
     <w:p>
       <w:pPr>
-        <w:spacing w:before="100" w:after="40" w:line="240" w:lineRule="auto"/>
+        <w:spacing w:before="80" w:after="30" w:line="240" w:lineRule="auto"/>
         <w:pBdr>
           <w:bottom w:val="single" w:sz="6" w:space="1" w:color="2563EB"/>
         </w:pBdr>
@@ -464,16 +486,16 @@
           <w:rFonts w:ascii="Calibri" w:hAnsi="Calibri"/>
           <w:b/>
           <w:color w:val="1E293B"/>
-          <w:sz w:val="21"/>
+          <w:sz w:val="20"/>
         </w:rPr>
         <w:t>VOLUNTEERING, LEADERSHIP &amp; ATHLETICS</w:t>
       </w:r>
     </w:p>
     <w:p>
       <w:pPr>
-        <w:spacing w:before="60" w:after="20" w:line="252" w:lineRule="auto"/>
+        <w:spacing w:before="44" w:after="16" w:line="245" w:lineRule="auto"/>
         <w:tabs>
-          <w:tab w:val="right" w:pos="10800"/>
+          <w:tab w:val="right" w:pos="10900"/>
         </w:tabs>
       </w:pPr>
       <w:r>
@@ -509,7 +531,7 @@
     </w:p>
     <w:p>
       <w:pPr>
-        <w:spacing w:before="0" w:after="30" w:line="252" w:lineRule="auto"/>
+        <w:spacing w:before="0" w:after="20" w:line="245" w:lineRule="auto"/>
         <w:ind w:left="259" w:hanging="202"/>
       </w:pPr>
       <w:r>
@@ -531,9 +553,9 @@
     </w:p>
     <w:p>
       <w:pPr>
-        <w:spacing w:before="60" w:after="20" w:line="252" w:lineRule="auto"/>
+        <w:spacing w:before="44" w:after="16" w:line="245" w:lineRule="auto"/>
         <w:tabs>
-          <w:tab w:val="right" w:pos="10800"/>
+          <w:tab w:val="right" w:pos="10900"/>
         </w:tabs>
       </w:pPr>
       <w:r>
@@ -569,7 +591,7 @@
     </w:p>
     <w:p>
       <w:pPr>
-        <w:spacing w:before="0" w:after="30" w:line="252" w:lineRule="auto"/>
+        <w:spacing w:before="0" w:after="20" w:line="245" w:lineRule="auto"/>
         <w:ind w:left="259" w:hanging="202"/>
       </w:pPr>
       <w:r>
@@ -591,7 +613,7 @@
     </w:p>
     <w:p>
       <w:pPr>
-        <w:spacing w:before="100" w:after="40" w:line="240" w:lineRule="auto"/>
+        <w:spacing w:before="80" w:after="30" w:line="240" w:lineRule="auto"/>
         <w:pBdr>
           <w:bottom w:val="single" w:sz="6" w:space="1" w:color="2563EB"/>
         </w:pBdr>
@@ -601,16 +623,16 @@
           <w:rFonts w:ascii="Calibri" w:hAnsi="Calibri"/>
           <w:b/>
           <w:color w:val="1E293B"/>
-          <w:sz w:val="21"/>
+          <w:sz w:val="20"/>
         </w:rPr>
         <w:t>EDUCATION &amp; ACADEMIC GOALS</w:t>
       </w:r>
     </w:p>
     <w:p>
       <w:pPr>
-        <w:spacing w:before="60" w:after="20" w:line="252" w:lineRule="auto"/>
+        <w:spacing w:before="44" w:after="16" w:line="245" w:lineRule="auto"/>
         <w:tabs>
-          <w:tab w:val="right" w:pos="10800"/>
+          <w:tab w:val="right" w:pos="10900"/>
         </w:tabs>
       </w:pPr>
       <w:r>
@@ -646,7 +668,7 @@
     </w:p>
     <w:p>
       <w:pPr>
-        <w:spacing w:before="0" w:after="30" w:line="252" w:lineRule="auto"/>
+        <w:spacing w:before="0" w:after="20" w:line="245" w:lineRule="auto"/>
         <w:ind w:left="259" w:hanging="202"/>
       </w:pPr>
       <w:r>
@@ -668,7 +690,7 @@
     </w:p>
     <w:p>
       <w:pPr>
-        <w:spacing w:before="0" w:after="30" w:line="252" w:lineRule="auto"/>
+        <w:spacing w:before="0" w:after="20" w:line="245" w:lineRule="auto"/>
         <w:ind w:left="259" w:hanging="202"/>
       </w:pPr>
       <w:r>
@@ -699,7 +721,7 @@
     </w:p>
     <w:p>
       <w:pPr>
-        <w:spacing w:before="100" w:after="40" w:line="240" w:lineRule="auto"/>
+        <w:spacing w:before="80" w:after="30" w:line="240" w:lineRule="auto"/>
         <w:pBdr>
           <w:bottom w:val="single" w:sz="6" w:space="1" w:color="2563EB"/>
         </w:pBdr>
@@ -709,14 +731,14 @@
           <w:rFonts w:ascii="Calibri" w:hAnsi="Calibri"/>
           <w:b/>
           <w:color w:val="1E293B"/>
-          <w:sz w:val="21"/>
+          <w:sz w:val="20"/>
         </w:rPr>
         <w:t>CORE SKILLS &amp; TECHNICAL COMPETENCIES</w:t>
       </w:r>
     </w:p>
     <w:p>
       <w:pPr>
-        <w:spacing w:before="0" w:after="30" w:line="252" w:lineRule="auto"/>
+        <w:spacing w:before="0" w:after="20" w:line="245" w:lineRule="auto"/>
         <w:ind w:left="259" w:hanging="202"/>
       </w:pPr>
       <w:r>
@@ -742,12 +764,12 @@
           <w:color w:val="334155"/>
           <w:sz w:val="18"/>
         </w:rPr>
-        <w:t>Next.js 15, React 19, TypeScript, JavaScript (ES6+), Node.js, Tailwind CSS, HTML5/CSS3, Python (Foundations).</w:t>
+        <w:t>Next.js 15, React 19, TypeScript, JavaScript (ES6+), Node.js, Tailwind CSS, HTML5/CSS3, Python (NumPy, DataCamp Certified).</w:t>
       </w:r>
     </w:p>
     <w:p>
       <w:pPr>
-        <w:spacing w:before="0" w:after="30" w:line="252" w:lineRule="auto"/>
+        <w:spacing w:before="0" w:after="20" w:line="245" w:lineRule="auto"/>
         <w:ind w:left="259" w:hanging="202"/>
       </w:pPr>
       <w:r>
@@ -778,7 +800,7 @@
     </w:p>
     <w:p>
       <w:pPr>
-        <w:spacing w:before="0" w:after="30" w:line="252" w:lineRule="auto"/>
+        <w:spacing w:before="0" w:after="20" w:line="245" w:lineRule="auto"/>
         <w:ind w:left="259" w:hanging="202"/>
       </w:pPr>
       <w:r>
@@ -809,7 +831,7 @@
     </w:p>
     <w:p>
       <w:pPr>
-        <w:spacing w:before="0" w:after="30" w:line="252" w:lineRule="auto"/>
+        <w:spacing w:before="0" w:after="20" w:line="245" w:lineRule="auto"/>
         <w:ind w:left="259" w:hanging="202"/>
       </w:pPr>
       <w:r>
@@ -840,7 +862,7 @@
     </w:p>
     <w:sectPr>
       <w:pgSz w:w="12240" w:h="15840"/>
-      <w:pgMar w:top="605" w:right="720" w:bottom="605" w:left="720" w:header="720" w:footer="720" w:gutter="0"/>
+      <w:pgMar w:top="547" w:right="648" w:bottom="547" w:left="648" w:header="720" w:footer="720" w:gutter="0"/>
       <w:cols w:space="720"/>
       <w:docGrid w:linePitch="360"/>
     </w:sectPr>

</xml_diff>